<commit_message>
Bring the method and the structure submission in line with R1
T03_R01 section 15 gains the step that was missing from the method:
separate constructed assets from proposed alignments on the status
field, and confirm it against the installation date, source and project
code, before any quantity is taken from the dataset. Its data-problem
paragraph now says no diameter and no level is recorded on the
constructed network, which is the accurate version.

The structure submission gains two sections: the presentation
conventions, so equations, footnotes, one figure sequence for maps
charts and diagrams, and frozen revisions form part of what NWS
approves; and the two-networks finding, because it determines that
section 18 cannot be completed from the data supplied.

Co-Authored-By: Claude Fable 5 <noreply@anthropic.com>
</commit_message>
<xml_diff>
--- a/TUTORIALS/T03_R01/T03_R01_Concept_Design_Methodology.docx
+++ b/TUTORIALS/T03_R01/T03_R01_Concept_Design_Methodology.docx
@@ -19020,7 +19020,7 @@
           <w:b w:val="0"/>
           <w:i w:val="0"/>
         </w:rPr>
-        <w:t>NWS's asset GIS carries the existing sewer, force main and treated effluent networks as geometry. Most of the sewer segments carry no recorded diameter. The tender itself states that the existing network layout is based on available information and is inaccurate, and makes preparing complete as-built records and GIS part of the consultant's scope.</w:t>
+        <w:t>NWS's asset GIS carries the sewer, force main and treated effluent networks as geometry, constructed and proposed together. No diameter and no invert level is recorded on the constructed gravity network at all. The tender itself states that the existing network layout is based on available information and is inaccurate, and makes preparing complete as-built records and GIS part of the consultant's scope.</w:t>
       </w:r>
     </w:p>
     <w:p>
@@ -19050,6 +19050,34 @@
         <w:t>Because NWS has declared its own data inaccurate in the contract, the survey and as-built exercise is a funded obligation rather than a favour, and no design conclusion needs to rest on records the client has already disowned.</w:t>
       </w:r>
     </w:p>
+    <w:p/>
+    <w:p>
+      <w:pPr>
+        <w:spacing w:before="160" w:after="160"/>
+        <w:ind w:left="170"/>
+        <w:shd w:val="clear" w:color="auto" w:fill="FBF0E4"/>
+        <w:pBdr>
+          <w:top w:val="single" w:sz="6" w:space="6" w:color="D9A441"/>
+          <w:left w:val="single" w:sz="6" w:space="6" w:color="D9A441"/>
+          <w:bottom w:val="single" w:sz="6" w:space="6" w:color="D9A441"/>
+          <w:right w:val="single" w:sz="6" w:space="6" w:color="D9A441"/>
+        </w:pBdr>
+      </w:pPr>
+      <w:r>
+        <w:rPr>
+          <w:b/>
+          <w:color w:val="A61B1B"/>
+          <w:sz w:val="20"/>
+        </w:rPr>
+        <w:t xml:space="preserve">Establish what is built before measuring anything.  </w:t>
+      </w:r>
+      <w:r>
+        <w:rPr>
+          <w:sz w:val="20"/>
+        </w:rPr>
+        <w:t>An asset GIS commonly holds proposed alignments alongside constructed ones, and a length taken from it without filtering overstates the asset base. In the Ibri dataset the operational status field separates the two, and four further fields agree with it on every record: installation date, source, project code and a remark. Constructed assets carry a date and a drawing or survey source; proposed ones carry an asset-planning source and a planning project code. Filter first, then measure, and state the two figures separately wherever either is quoted.</w:t>
+      </w:r>
+    </w:p>
     <w:p>
       <w:pPr>
         <w:pStyle w:val="Heading2"/>
@@ -19070,7 +19098,7 @@
         <w:t xml:space="preserve">1.   </w:t>
       </w:r>
       <w:r>
-        <w:t>Survey: cover and invert levels, diameters, materials, gradients, house connections, riders, lifting stations and rising mains.</w:t>
+        <w:t>Separate constructed assets from proposed alignments on the status field, and confirm the split against the installation date, the source and the project code before any quantity is taken from the dataset.</w:t>
       </w:r>
     </w:p>
     <w:p>
@@ -19085,7 +19113,7 @@
         <w:t xml:space="preserve">2.   </w:t>
       </w:r>
       <w:r>
-        <w:t>CCTV inspection for condition, carried out early rather than at detailed design.</w:t>
+        <w:t>Survey: cover and invert levels, diameters, materials, gradients, house connections, riders, lifting stations and rising mains.</w:t>
       </w:r>
     </w:p>
     <w:p>
@@ -19100,7 +19128,7 @@
         <w:t xml:space="preserve">3.   </w:t>
       </w:r>
       <w:r>
-        <w:t>Build the as-built and GIS to NWS specification and upload it to their system, subject to their acceptance.</w:t>
+        <w:t>CCTV inspection for condition, carried out early rather than at detailed design.</w:t>
       </w:r>
     </w:p>
     <w:p>
@@ -19115,7 +19143,7 @@
         <w:t xml:space="preserve">4.   </w:t>
       </w:r>
       <w:r>
-        <w:t>Model the existing network against future flows to find where capacity runs out and when.</w:t>
+        <w:t>Build the as-built and GIS to NWS specification and upload it to their system, subject to their acceptance.</w:t>
       </w:r>
     </w:p>
     <w:p>
@@ -19130,7 +19158,7 @@
         <w:t xml:space="preserve">5.   </w:t>
       </w:r>
       <w:r>
-        <w:t>Classify each asset: adequate and retained, adequate but needing rehabilitation, or to be replaced.</w:t>
+        <w:t>Model the existing network against future flows to find where capacity runs out and when.</w:t>
       </w:r>
     </w:p>
     <w:p>
@@ -19143,6 +19171,21 @@
           <w:b/>
         </w:rPr>
         <w:t xml:space="preserve">6.   </w:t>
+      </w:r>
+      <w:r>
+        <w:t>Classify each asset: adequate and retained, adequate but needing rehabilitation, or to be replaced.</w:t>
+      </w:r>
+    </w:p>
+    <w:p>
+      <w:pPr>
+        <w:spacing w:after="60"/>
+        <w:ind w:left="510" w:hanging="510"/>
+      </w:pPr>
+      <w:r>
+        <w:rPr>
+          <w:b/>
+        </w:rPr>
+        <w:t xml:space="preserve">7.   </w:t>
       </w:r>
       <w:r>
         <w:t>Design the integration points between old and new, and between the old plant and the new one.</w:t>

</xml_diff>

<commit_message>
Route the flowchart the way the user drew it
Two fixes to the edge router, both general rather than one-off.

A bus route: when a line leaves and enters on the same side, it now runs
outside the column instead of taking the midpoint, which would have
drawn it down the box borders. That gives the three cost streams a clean
collection on the right edge into step 4, and step 4 a left exit into
step 5 - the page reads as one line turning at each edge instead of
three arrows cutting back through the middle.

Row spans, not row indices: the side-picker treated a three-row-tall box
as living in row 0, so anything below it got a bottom-to-top dogleg. It
now compares the full span, and a tall box leaves at the height of
whatever it is joining, so the three connections out of the options box
are straight and direct. For a height-1 node the test is identical to
the old one, and D1 to D5 re-rendered unchanged.

Report 67 pages, tutorial 61.

Co-Authored-By: Claude Fable 5 <noreply@anthropic.com>
</commit_message>
<xml_diff>
--- a/TUTORIALS/T03_R01/T03_R01_Concept_Design_Methodology.docx
+++ b/TUTORIALS/T03_R01/T03_R01_Concept_Design_Methodology.docx
@@ -25727,7 +25727,7 @@
       <w:r>
         <w:drawing>
           <wp:inline xmlns:a="http://schemas.openxmlformats.org/drawingml/2006/main" xmlns:pic="http://schemas.openxmlformats.org/drawingml/2006/picture">
-            <wp:extent cx="5832000" cy="3368839"/>
+            <wp:extent cx="5832000" cy="3512622"/>
             <wp:docPr id="14" name="Picture 14"/>
             <wp:cNvGraphicFramePr>
               <a:graphicFrameLocks noChangeAspect="1"/>
@@ -25748,7 +25748,7 @@
                   <pic:spPr>
                     <a:xfrm>
                       <a:off x="0" y="0"/>
-                      <a:ext cx="5832000" cy="3368839"/>
+                      <a:ext cx="5832000" cy="3512622"/>
                     </a:xfrm>
                     <a:prstGeom prst="rect"/>
                   </pic:spPr>

</xml_diff>